<commit_message>
UI, DB connect and storage for web pages created
</commit_message>
<xml_diff>
--- a/Project_Development_Bloodbank_document.docx
+++ b/Project_Development_Bloodbank_document.docx
@@ -191,7 +191,10 @@
           </w:tcPr>
           <w:p>
             <w:r>
-              <w:t>Anushka Marsello</w:t>
+              <w:t>Anushka Mar</w:t>
+            </w:r>
+            <w:r>
+              <w:t>celo</w:t>
             </w:r>
           </w:p>
         </w:tc>
@@ -305,8 +308,13 @@
           </w:tcPr>
           <w:p>
             <w:r>
-              <w:t>Rupali Arlekar</w:t>
+              <w:t xml:space="preserve">Rupali </w:t>
             </w:r>
+            <w:proofErr w:type="spellStart"/>
+            <w:r>
+              <w:t>Arlekar</w:t>
+            </w:r>
+            <w:proofErr w:type="spellEnd"/>
           </w:p>
         </w:tc>
         <w:tc>
@@ -722,6 +730,31 @@
       <w:r>
         <w:t>Week 1</w:t>
       </w:r>
+      <w:r>
+        <w:t>:</w:t>
+      </w:r>
+      <w:r>
+        <w:rPr>
+          <w:rFonts w:ascii="Roboto" w:hAnsi="Roboto"/>
+          <w:color w:val="1F1F1F"/>
+          <w:sz w:val="21"/>
+          <w:szCs w:val="21"/>
+          <w:shd w:val="clear" w:color="auto" w:fill="FFFFFF"/>
+        </w:rPr>
+        <w:t xml:space="preserve"> </w:t>
+      </w:r>
+      <w:r>
+        <w:t>2</w:t>
+      </w:r>
+      <w:r>
+        <w:t>2</w:t>
+      </w:r>
+      <w:r>
+        <w:t>/02/2026</w:t>
+      </w:r>
+      <w:r>
+        <w:t xml:space="preserve"> </w:t>
+      </w:r>
     </w:p>
     <w:p>
       <w:pPr>
@@ -762,6 +795,18 @@
       <w:r>
         <w:t>2</w:t>
       </w:r>
+      <w:r>
+        <w:t>: 0</w:t>
+      </w:r>
+      <w:r>
+        <w:t>2/0</w:t>
+      </w:r>
+      <w:r>
+        <w:t>3</w:t>
+      </w:r>
+      <w:r>
+        <w:t>/2026</w:t>
+      </w:r>
     </w:p>
     <w:p>
       <w:pPr>
@@ -787,6 +832,28 @@
     </w:p>
     <w:p>
       <w:pPr>
+        <w:ind w:left="360"/>
+      </w:pPr>
+    </w:p>
+    <w:p>
+      <w:r>
+        <w:t xml:space="preserve">Week </w:t>
+      </w:r>
+      <w:r>
+        <w:t>3: 1</w:t>
+      </w:r>
+      <w:r>
+        <w:t>2/0</w:t>
+      </w:r>
+      <w:r>
+        <w:t>3</w:t>
+      </w:r>
+      <w:r>
+        <w:t>/2026</w:t>
+      </w:r>
+    </w:p>
+    <w:p>
+      <w:pPr>
         <w:numPr>
           <w:ilvl w:val="0"/>
           <w:numId w:val="1"/>
@@ -797,11 +864,6 @@
       </w:r>
     </w:p>
     <w:p>
-      <w:r>
-        <w:t>Week 2</w:t>
-      </w:r>
-    </w:p>
-    <w:p>
       <w:pPr>
         <w:numPr>
           <w:ilvl w:val="0"/>
@@ -823,61 +885,6 @@
         <w:t>Search functionality</w:t>
       </w:r>
     </w:p>
-    <w:p>
-      <w:r>
-        <w:t>Week 3</w:t>
-      </w:r>
-    </w:p>
-    <w:p>
-      <w:pPr>
-        <w:numPr>
-          <w:ilvl w:val="0"/>
-          <w:numId w:val="3"/>
-        </w:numPr>
-      </w:pPr>
-      <w:r>
-        <w:t>Blood request system</w:t>
-      </w:r>
-    </w:p>
-    <w:p>
-      <w:pPr>
-        <w:numPr>
-          <w:ilvl w:val="0"/>
-          <w:numId w:val="3"/>
-        </w:numPr>
-      </w:pPr>
-      <w:r>
-        <w:t>Admin panel</w:t>
-      </w:r>
-    </w:p>
-    <w:p>
-      <w:r>
-        <w:t>Week 4</w:t>
-      </w:r>
-    </w:p>
-    <w:p>
-      <w:pPr>
-        <w:numPr>
-          <w:ilvl w:val="0"/>
-          <w:numId w:val="4"/>
-        </w:numPr>
-      </w:pPr>
-      <w:r>
-        <w:t>Security improvements</w:t>
-      </w:r>
-    </w:p>
-    <w:p>
-      <w:pPr>
-        <w:numPr>
-          <w:ilvl w:val="0"/>
-          <w:numId w:val="4"/>
-        </w:numPr>
-      </w:pPr>
-      <w:r>
-        <w:t>Testing</w:t>
-      </w:r>
-    </w:p>
-    <w:p/>
     <w:sectPr>
       <w:pgSz w:w="11906" w:h="16838"/>
       <w:pgMar w:top="1440" w:right="1440" w:bottom="1440" w:left="1440" w:header="708" w:footer="708" w:gutter="0"/>

</xml_diff>